<commit_message>
Evidencia de Instagram y carpeta del Sprint 3 actualizada al 28/10 (Sprint 3, semana 9)
Capturas de la cuenta @woodbird.ar (perfil, P1, P2, H1 y H3) y foto de perfil.
La campaña se publicó el 27/10, cuatro días después de lo planificado: se
registra en el calendario de la campaña, en la matriz de riesgos (R1 a R3) y en
el registro de solicitudes de cambio. La carpeta se entrega el 28/10.

Co-Authored-By: Claude Opus 5.5 <noreply@anthropic.com>
</commit_message>
<xml_diff>
--- a/docs/sprint-3/02_Matriz_de_Riesgos.docx
+++ b/docs/sprint-3/02_Matriz_de_Riesgos.docx
@@ -100,7 +100,7 @@
                 <w:b w:val="0"/>
                 <w:sz w:val="18"/>
               </w:rPr>
-              <w:t>Sprint 3 — Tarea 3.4: Reevaluación de la matriz de riesgos tras la integración de JavaScript (corte 22/10)</w:t>
+              <w:t>Sprint 3 — Tarea 3.4: Reevaluación de la matriz de riesgos tras la integración de JavaScript (corte 28/10)</w:t>
             </w:r>
           </w:p>
         </w:tc>
@@ -4198,7 +4198,7 @@
         <w:pStyle w:val="Heading1"/>
       </w:pPr>
       <w:r>
-        <w:t>5. Seguimiento al 22/10</w:t>
+        <w:t>5. Seguimiento al 28/10</w:t>
       </w:r>
     </w:p>
     <w:p>
@@ -4292,7 +4292,7 @@
                 <w:color w:val="FFFFFF"/>
                 <w:sz w:val="18"/>
               </w:rPr>
-              <w:t>Estado al 22/10</w:t>
+              <w:t>Estado al 28/10</w:t>
             </w:r>
           </w:p>
         </w:tc>
@@ -4328,7 +4328,7 @@
                 <w:b w:val="0"/>
                 <w:sz w:val="18"/>
               </w:rPr>
-              <w:t>Sí. Entre el 05/10 y el 21/10 no hubo avances registrados: ningún commit ni movimiento en el tablero. Las tareas 3.1, 3.2, 3.7 y 3.8 se resolvieron el 22/10.</w:t>
+              <w:t>Sí. Entre el 05/10 y el 21/10 no hubo avances registrados: ningún commit ni movimiento en el tablero. Las tareas 3.1, 3.2, 3.7 y 3.8 se resolvieron el 22/10. La entrega del 23/10 no se cumplió: la carpeta se entrega el 28/10.</w:t>
             </w:r>
           </w:p>
         </w:tc>
@@ -4398,7 +4398,7 @@
                 <w:b w:val="0"/>
                 <w:sz w:val="18"/>
               </w:rPr>
-              <w:t>Sí. El trabajo empezó 17 días después del inicio del sprint (05/10 → 22/10). Desvío: Fetch +13 días; Términos y Condiciones +6 días.</w:t>
+              <w:t>Sí. El trabajo empezó 17 días después del inicio del sprint (05/10 → 22/10). Desvío: Fetch +13 días; Términos y Condiciones +6 días; campaña de Instagram +4 días; entrega de la carpeta +5 días (23/10 → 28/10).</w:t>
             </w:r>
           </w:p>
         </w:tc>
@@ -4415,7 +4415,7 @@
                 <w:b w:val="0"/>
                 <w:sz w:val="18"/>
               </w:rPr>
-              <w:t>Fast tracking: carrito y Términos y Condiciones se resolvieron el mismo día, con la tabla de coherencia como vínculo entre ambos.</w:t>
+              <w:t>Fast tracking: carrito y Términos y Condiciones se resolvieron el mismo día, con la tabla de coherencia como vínculo entre ambos. No alcanzó para la campaña de Instagram, y la entrega se corrió al 28/10 para incluir la evidencia de publicación.</w:t>
             </w:r>
           </w:p>
         </w:tc>
@@ -4432,7 +4432,7 @@
                 <w:b w:val="0"/>
                 <w:sz w:val="18"/>
               </w:rPr>
-              <w:t>Activo hasta la entrega del 23/10.</w:t>
+              <w:t>Cerrado para el Sprint 3, con atraso. Pasa al Sprint 4 con hitos semanales.</w:t>
             </w:r>
           </w:p>
         </w:tc>
@@ -4468,7 +4468,7 @@
                 <w:b w:val="0"/>
                 <w:sz w:val="18"/>
               </w:rPr>
-              <w:t>En curso: al 22/10 no hay publicaciones.</w:t>
+              <w:t>Parcialmente. La cuenta no se creó el 23/10, sino el 27/10, y ese día se publicaron las ocho piezas juntas, sin escalonarlas.</w:t>
             </w:r>
           </w:p>
         </w:tc>
@@ -4485,7 +4485,7 @@
                 <w:b w:val="0"/>
                 <w:sz w:val="18"/>
               </w:rPr>
-              <w:t>Pendiente: la tarea 3.5 se trata el 23/10.</w:t>
+              <w:t>Se publicó la campaña completa antes de entregar. El 28/10 se corrigieron el usuario (wood_bird_shop → woodbird.ar) y la historia H1, que no tenía la encuesta. Capturas en la carpeta.</w:t>
             </w:r>
           </w:p>
         </w:tc>
@@ -4502,7 +4502,7 @@
                 <w:b w:val="0"/>
                 <w:sz w:val="18"/>
               </w:rPr>
-              <w:t>Abierto. Responsable de Negocio.</w:t>
+              <w:t>Cerrado. La medición con datos reales pasa al Sprint 4.</w:t>
             </w:r>
           </w:p>
         </w:tc>
@@ -4538,7 +4538,7 @@
                 <w:b w:val="0"/>
                 <w:sz w:val="18"/>
               </w:rPr>
-              <w:t>Sin cambios: el docente no respondió la SC-01.</w:t>
+              <w:t>Sin cambios: al 28/10 el docente no respondió la SC-01.</w:t>
             </w:r>
           </w:p>
         </w:tc>
@@ -4818,7 +4818,7 @@
                 <w:b w:val="0"/>
                 <w:sz w:val="18"/>
               </w:rPr>
-              <w:t>Parcialmente: el token de Trello vence el 22/10.</w:t>
+              <w:t>Parcialmente: el token de Trello venció el 22/10.</w:t>
             </w:r>
           </w:p>
         </w:tc>
@@ -4835,7 +4835,7 @@
                 <w:b w:val="0"/>
                 <w:sz w:val="18"/>
               </w:rPr>
-              <w:t>El tablero se actualizó ese mismo día, antes del vencimiento. Queda regenerar el token.</w:t>
+              <w:t>Se regeneró ese mismo día y se cargaron las etiquetas de las tarjetas del Sprint 3. El nuevo token vence alrededor del 21/11.</w:t>
             </w:r>
           </w:p>
         </w:tc>
@@ -4852,7 +4852,7 @@
                 <w:b w:val="0"/>
                 <w:sz w:val="18"/>
               </w:rPr>
-              <w:t>Monitoreo.</w:t>
+              <w:t>Monitoreo: renovarlo antes del 21/11.</w:t>
             </w:r>
           </w:p>
         </w:tc>
@@ -5352,7 +5352,7 @@
     </w:p>
     <w:p>
       <w:r>
-        <w:t>Declaro revisados los riesgos del Sprint 3 al 22/10. Quedan activos R1 y R2 (Alto) hasta la entrega del 23/10, y abiertos R3, R4 y R8, con responsable asignado.</w:t>
+        <w:t>Declaro revisados los riesgos del Sprint 3 al 28/10. R1 y R2 se materializaron: la carpeta se entrega el 28/10, cinco días después de la fecha prevista. Queda activo R1 (Alto) y abiertos R4 y R8, con responsable asignado.</w:t>
       </w:r>
     </w:p>
     <w:p>

</xml_diff>